<commit_message>
day-06: type hints, dataclasses, build_messages()
</commit_message>
<xml_diff>
--- a/notes/AI-Study-Comprehensive-Notes.docx
+++ b/notes/AI-Study-Comprehensive-Notes.docx
@@ -104,7 +104,7 @@
           <w:rFonts w:ascii="Arial"/>
           <w:color w:val="2C3E50"/>
         </w:rPr>
-        <w:t xml:space="preserve">May 2026 — Day 5 (Review &amp; Refactor)</w:t>
+        <w:t xml:space="preserve">May 2026 — Week 01, Day 01 (Week-01 Session A — Type Hints &amp; Dataclasses)</w:t>
       </w:r>
     </w:p>
     <w:p>
@@ -128,7 +128,7 @@
           <w:rFonts w:ascii="Arial"/>
           <w:color w:val="2C3E50"/>
         </w:rPr>
-        <w:t xml:space="preserve">day-05-review/day-05-review-and-refine.py — full chatbot using /api/chat, system prompt, sliding window memory, error handling</w:t>
+        <w:t xml:space="preserve">week-00/day-005-review/day-005-review-and-refine.py — added type hints to all functions, ChatMessage &amp; ChatConfig dataclasses, build_messages() converter</w:t>
       </w:r>
     </w:p>
     <w:p>
@@ -200,7 +200,7 @@
           <w:rFonts w:ascii="Arial"/>
           <w:color w:val="2C3E50"/>
         </w:rPr>
-        <w:t xml:space="preserve">Week 1 exercises: deepen Python fundamentals, experiment with system prompts, try swapping llama3 model settings</w:t>
+        <w:t xml:space="preserve">Day 02 — Virtual Environments &amp; Packaging: create pyproject.toml, src/ layout, pip install -e .</w:t>
       </w:r>
     </w:p>
     <w:p>

</xml_diff>